<commit_message>
Informe de la represa: seccion 5 descriptiva, sin el ratio 78,7
La seccion pasa a llamarse «El sistema de riego al que la obra serviria» y
pierde la fila de hectareas regadas por hectarea de represa: el cociente de
superficies se leia como afirmacion de rendimiento hidrico del embalse, que
corresponde al diseno del consorcio. Mismo criterio ya aplicado a la
pantalla web en cdae180.

Co-Authored-By: Claude Fable 5 <noreply@anthropic.com>
</commit_message>
<xml_diff>
--- a/docs/INFORME-represa-emplazamiento.docx
+++ b/docs/INFORME-represa-emplazamiento.docx
@@ -675,7 +675,7 @@
           <w:sz w:val="26"/>
           <w:szCs w:val="26"/>
         </w:rPr>
-        <w:t xml:space="preserve">5. Magnitud del proyecto frente al sistema de riego</w:t>
+        <w:t xml:space="preserve">5. El sistema de riego al que la obra serviría</w:t>
       </w:r>
     </w:p>
     <w:p>
@@ -688,7 +688,7 @@
           <w:sz w:val="22"/>
           <w:szCs w:val="22"/>
         </w:rPr>
-        <w:t xml:space="preserve">Como referencia de la escala del beneficio, las cifras vigentes del padrón de usuarios:</w:t>
+        <w:t xml:space="preserve">Cifras vigentes del padrón de usuarios del sistema:</w:t>
       </w:r>
     </w:p>
     <w:tbl>
@@ -868,7 +868,7 @@
                 <w:sz w:val="22"/>
                 <w:szCs w:val="22"/>
               </w:rPr>
-              <w:t xml:space="preserve">Hectáreas regadas por cada hectárea de represa</w:t>
+              <w:t xml:space="preserve">Sector 1</w:t>
             </w:r>
           </w:p>
         </w:tc>
@@ -894,7 +894,7 @@
                 <w:sz w:val="22"/>
                 <w:szCs w:val="22"/>
               </w:rPr>
-              <w:t xml:space="preserve">78,7 ha</w:t>
+              <w:t xml:space="preserve">3.407 predios · 2.308,1 ha</w:t>
             </w:r>
           </w:p>
         </w:tc>
@@ -916,7 +916,7 @@
                 <w:sz w:val="22"/>
                 <w:szCs w:val="22"/>
               </w:rPr>
-              <w:t xml:space="preserve">Sector 1</w:t>
+              <w:t xml:space="preserve">Sector 2</w:t>
             </w:r>
           </w:p>
         </w:tc>
@@ -941,7 +941,7 @@
                 <w:sz w:val="22"/>
                 <w:szCs w:val="22"/>
               </w:rPr>
-              <w:t xml:space="preserve">3.407 predios · 2.308,1 ha</w:t>
+              <w:t xml:space="preserve">2.246 predios · 1.228,2 ha</w:t>
             </w:r>
           </w:p>
         </w:tc>
@@ -964,7 +964,7 @@
                 <w:sz w:val="22"/>
                 <w:szCs w:val="22"/>
               </w:rPr>
-              <w:t xml:space="preserve">Sector 2</w:t>
+              <w:t xml:space="preserve">Sector 3</w:t>
             </w:r>
           </w:p>
         </w:tc>
@@ -972,53 +972,6 @@
           <w:tcPr>
             <w:tcW w:type="dxa" w:w="3200"/>
             <w:shd w:fill="F2F5F9" w:val="clear"/>
-            <w:tcMar>
-              <w:top w:type="dxa" w:w="60"/>
-              <w:left w:type="dxa" w:w="120"/>
-              <w:bottom w:type="dxa" w:w="60"/>
-              <w:right w:type="dxa" w:w="120"/>
-            </w:tcMar>
-          </w:tcPr>
-          <w:p>
-            <w:pPr>
-              <w:jc w:val="right"/>
-            </w:pPr>
-            <w:r>
-              <w:rPr>
-                <w:b/>
-                <w:bCs/>
-                <w:sz w:val="22"/>
-                <w:szCs w:val="22"/>
-              </w:rPr>
-              <w:t xml:space="preserve">2.246 predios · 1.228,2 ha</w:t>
-            </w:r>
-          </w:p>
-        </w:tc>
-      </w:tr>
-      <w:tr>
-        <w:tc>
-          <w:tcPr>
-            <w:tcW w:type="dxa" w:w="5800"/>
-            <w:tcMar>
-              <w:top w:type="dxa" w:w="60"/>
-              <w:left w:type="dxa" w:w="120"/>
-              <w:bottom w:type="dxa" w:w="60"/>
-              <w:right w:type="dxa" w:w="120"/>
-            </w:tcMar>
-          </w:tcPr>
-          <w:p>
-            <w:r>
-              <w:rPr>
-                <w:sz w:val="22"/>
-                <w:szCs w:val="22"/>
-              </w:rPr>
-              <w:t xml:space="preserve">Sector 3</w:t>
-            </w:r>
-          </w:p>
-        </w:tc>
-        <w:tc>
-          <w:tcPr>
-            <w:tcW w:type="dxa" w:w="3200"/>
             <w:tcMar>
               <w:top w:type="dxa" w:w="60"/>
               <w:left w:type="dxa" w:w="120"/>

</xml_diff>